<commit_message>
Regenerate all 56 template variants (DOCX + ODT) from updated templates
</commit_message>
<xml_diff>
--- a/template_variants/DOCX/3HE_3PET2_0EST.docx
+++ b/template_variants/DOCX/3HE_3PET2_0EST.docx
@@ -99,7 +99,27 @@
                 <w:sz w:val="32"/>
                 <w:szCs w:val="32"/>
               </w:rPr>
-              <w:t xml:space="preserve"> GwMKvjPvivj BÛvw÷ªR</w:t>
+              <w:t xml:space="preserve"> GwM</w:t>
+            </w:r>
+            <w:r>
+              <w:rPr>
+                <w:rFonts w:ascii="SutonnyMJ" w:hAnsi="SutonnyMJ" w:cs="SutonnyMJ"/>
+                <w:b/>
+                <w:sz w:val="32"/>
+                <w:szCs w:val="32"/>
+              </w:rPr>
+              <w:t>ª</w:t>
+            </w:r>
+            <w:bookmarkStart w:id="0" w:name="_GoBack"/>
+            <w:bookmarkEnd w:id="0"/>
+            <w:r>
+              <w:rPr>
+                <w:rFonts w:ascii="SutonnyMJ" w:hAnsi="SutonnyMJ" w:cs="SutonnyMJ"/>
+                <w:b/>
+                <w:sz w:val="32"/>
+                <w:szCs w:val="32"/>
+              </w:rPr>
+              <w:t>KvjPvivj BÛvw÷ªR</w:t>
             </w:r>
             <w:r>
               <w:rPr>
@@ -3357,6 +3377,9 @@
     </w:tbl>
     <w:p>
       <w:pPr>
+        <w:tabs>
+          <w:tab w:val="left" w:pos="1305"/>
+        </w:tabs>
         <w:jc w:val="both"/>
         <w:rPr>
           <w:rFonts w:ascii="SutonnyMJ" w:hAnsi="SutonnyMJ" w:cs="SutonnyMJ"/>
@@ -4645,6 +4668,9 @@
     </w:tbl>
     <w:p>
       <w:pPr>
+        <w:tabs>
+          <w:tab w:val="left" w:pos="1305"/>
+        </w:tabs>
         <w:jc w:val="both"/>
         <w:rPr>
           <w:rFonts w:ascii="SutonnyMJ" w:hAnsi="SutonnyMJ" w:cs="SutonnyMJ"/>
@@ -6698,7 +6724,7 @@
 </file>
 
 <file path=customXml/itemProps1.xml><?xml version="1.0" encoding="utf-8"?>
-<ds:datastoreItem xmlns:ds="http://schemas.openxmlformats.org/officeDocument/2006/customXml" ds:itemID="{2CA4E4BF-9652-4755-8186-43B6F7CAE77A}">
+<ds:datastoreItem xmlns:ds="http://schemas.openxmlformats.org/officeDocument/2006/customXml" ds:itemID="{303B2A5A-3B9B-4BF3-ACE4-018710CA10F1}">
   <ds:schemaRefs>
     <ds:schemaRef ds:uri="http://schemas.openxmlformats.org/officeDocument/2006/bibliography"/>
   </ds:schemaRefs>

</xml_diff>